<commit_message>
Simulação oficial de capacidade de pagamento FNE/BNB (Apêndice C)
Motor validado (algoritmo VBA do BNB): taxa 8,8945% a.a., 144 meses, receitas do
estudo v3, faixa de custo padrão 76,72-84,39% indicada pelo consultor, sem SER.
- R$ 4,8 mi reprovado em todas as combinações (51,3% a 108% de comprometimento)
- Máximo aprovável: R$ 4,46 mi (piso do custo, carência 24m) a R$ 2,99 mi (teto)
- Cenário de protocolo: R$ 4,4 mi / 144m / carência 24m = 49,1% (janela 30-50%)
- §13.4 do estudo amarrado ao anexo; DOCX com Apêndice C

Co-Authored-By: Claude Fable 5 <noreply@anthropic.com>
Claude-Session: https://claude.ai/code/session_01CKyLR5v4criVdVXwyZSi7P
</commit_message>
<xml_diff>
--- a/estudo-mercado-gtk/ESTUDO_DE_MERCADO_GTK_PRE-MOLDADOS.docx
+++ b/estudo-mercado-gtk/ESTUDO_DE_MERCADO_GTK_PRE-MOLDADOS.docx
@@ -13677,6 +13677,93 @@
       </w:r>
       <w:r>
         <w:t xml:space="preserve">, com a contrapartida própria reforçada (o capital subscrito de R$ 7,5 milhões comporta) — além da carência típica do FNE cobrindo o ramp-up do ano 1 e do bônus de adimplência dando folga adicional à cobertura.</w:t>
+      </w:r>
+    </w:p>
+    <w:p>
+      <w:pPr>
+        <w:pStyle w:val="BodyText"/>
+      </w:pPr>
+      <w:r>
+        <w:t xml:space="preserve">Essa recomendação foi</w:t>
+      </w:r>
+      <w:r>
+        <w:t xml:space="preserve"> </w:t>
+      </w:r>
+      <w:r>
+        <w:rPr>
+          <w:bCs/>
+          <w:b/>
+        </w:rPr>
+        <w:t xml:space="preserve">testada no algoritmo oficial de capacidade de pagamento do BNB</w:t>
+      </w:r>
+      <w:r>
+        <w:t xml:space="preserve"> </w:t>
+      </w:r>
+      <w:r>
+        <w:t xml:space="preserve">(anexo</w:t>
+      </w:r>
+      <w:r>
+        <w:t xml:space="preserve"> </w:t>
+      </w:r>
+      <w:r>
+        <w:t xml:space="preserve">“</w:t>
+      </w:r>
+      <w:r>
+        <w:t xml:space="preserve">Simulação FNE/BNB</w:t>
+      </w:r>
+      <w:r>
+        <w:t xml:space="preserve">”</w:t>
+      </w:r>
+      <w:r>
+        <w:t xml:space="preserve">): com taxa de 8,8945% a.a., 144 meses e a receita deste estudo, o pleito aprovável na janela de comprometimento de 30–50% do banco vai de</w:t>
+      </w:r>
+      <w:r>
+        <w:t xml:space="preserve"> </w:t>
+      </w:r>
+      <w:r>
+        <w:rPr>
+          <w:bCs/>
+          <w:b/>
+        </w:rPr>
+        <w:t xml:space="preserve">R$ 4,46 milhões</w:t>
+      </w:r>
+      <w:r>
+        <w:t xml:space="preserve"> </w:t>
+      </w:r>
+      <w:r>
+        <w:t xml:space="preserve">(custo padrão no piso da faixa de 76,72%, carência de 24 meses — comprometimento equalizado de 50,0%) a</w:t>
+      </w:r>
+      <w:r>
+        <w:t xml:space="preserve"> </w:t>
+      </w:r>
+      <w:r>
+        <w:rPr>
+          <w:bCs/>
+          <w:b/>
+        </w:rPr>
+        <w:t xml:space="preserve">~R$ 3,0 milhões</w:t>
+      </w:r>
+      <w:r>
+        <w:t xml:space="preserve"> </w:t>
+      </w:r>
+      <w:r>
+        <w:t xml:space="preserve">(custo padrão no teto de 84,39%), com R$ 4,8 milhões reprovado em qualquer combinação. O cenário de protocolo sugerido é</w:t>
+      </w:r>
+      <w:r>
+        <w:t xml:space="preserve"> </w:t>
+      </w:r>
+      <w:r>
+        <w:rPr>
+          <w:bCs/>
+          <w:b/>
+        </w:rPr>
+        <w:t xml:space="preserve">R$ 4,4 milhões / 144 meses / carência 24 meses</w:t>
+      </w:r>
+      <w:r>
+        <w:t xml:space="preserve"> </w:t>
+      </w:r>
+      <w:r>
+        <w:t xml:space="preserve">(comprometimento 49,1% no piso da faixa), com plano B dimensionado para ~R$ 3,0 milhões caso o analista aplique o teto do custo padrão.</w:t>
       </w:r>
     </w:p>
     <w:p>
@@ -22367,6 +22454,1001 @@
     </w:p>
     <w:bookmarkEnd w:id="112"/>
     <w:bookmarkEnd w:id="113"/>
+    <w:bookmarkStart w:id="118" w:name="X165649e01e6bfe456e61d0f721d7b48c2890be6"/>
+    <w:p>
+      <w:pPr>
+        <w:pStyle w:val="Heading1"/>
+      </w:pPr>
+      <w:r>
+        <w:t xml:space="preserve">APÊNDICE C — SIMULAÇÃO DE CAPACIDADE DE PAGAMENTO FNE/BNB (algoritmo oficial)</w:t>
+      </w:r>
+    </w:p>
+    <w:p>
+      <w:pPr>
+        <w:pStyle w:val="FirstParagraph"/>
+      </w:pPr>
+      <w:r>
+        <w:rPr>
+          <w:bCs/>
+          <w:b/>
+        </w:rPr>
+        <w:t xml:space="preserve">GTK Pré-Moldados Ltda</w:t>
+      </w:r>
+      <w:r>
+        <w:t xml:space="preserve"> </w:t>
+      </w:r>
+      <w:r>
+        <w:t xml:space="preserve">· 16/08/2026 · Motor que replica a macro VBA</w:t>
+      </w:r>
+      <w:r>
+        <w:t xml:space="preserve"> </w:t>
+      </w:r>
+      <w:r>
+        <w:rPr>
+          <w:rStyle w:val="VerbatimChar"/>
+        </w:rPr>
+        <w:t xml:space="preserve">calcularAmortizacaoIndustrial</w:t>
+      </w:r>
+      <w:r>
+        <w:t xml:space="preserve"> </w:t>
+      </w:r>
+      <w:r>
+        <w:t xml:space="preserve">da planilha oficial do BNB (validado ao centavo em 3 projetos reais — 76/76 valores). Cenário A (regra oficial: aplicação integral no ano 1).</w:t>
+      </w:r>
+    </w:p>
+    <w:bookmarkStart w:id="114" w:name="premissas-confirmadas-pelo-consultor"/>
+    <w:p>
+      <w:pPr>
+        <w:pStyle w:val="Heading2"/>
+      </w:pPr>
+      <w:r>
+        <w:t xml:space="preserve">Premissas (confirmadas pelo consultor)</w:t>
+      </w:r>
+    </w:p>
+    <w:tbl>
+      <w:tblPr>
+        <w:tblStyle w:val="Table"/>
+        <w:tblW w:type="pct" w:w="5000"/>
+        <w:tblLook w:firstRow="1" w:lastRow="0" w:firstColumn="0" w:lastColumn="0" w:noHBand="0" w:noVBand="0" w:val="0020"/>
+        <w:jc w:val="start"/>
+      </w:tblPr>
+      <w:tblGrid>
+        <w:gridCol w:w="3960"/>
+        <w:gridCol w:w="3960"/>
+      </w:tblGrid>
+      <w:tr>
+        <w:trPr>
+          <w:tblHeader w:val="true"/>
+        </w:trPr>
+        <w:tc>
+          <w:tcPr/>
+          <w:p>
+            <w:pPr>
+              <w:pStyle w:val="Compact"/>
+              <w:jc w:val="left"/>
+            </w:pPr>
+            <w:r>
+              <w:t xml:space="preserve">Parâmetro</w:t>
+            </w:r>
+          </w:p>
+        </w:tc>
+        <w:tc>
+          <w:tcPr/>
+          <w:p>
+            <w:pPr>
+              <w:pStyle w:val="Compact"/>
+              <w:jc w:val="left"/>
+            </w:pPr>
+            <w:r>
+              <w:t xml:space="preserve">Valor</w:t>
+            </w:r>
+          </w:p>
+        </w:tc>
+      </w:tr>
+      <w:tr>
+        <w:tc>
+          <w:tcPr/>
+          <w:p>
+            <w:pPr>
+              <w:pStyle w:val="Compact"/>
+              <w:jc w:val="left"/>
+            </w:pPr>
+            <w:r>
+              <w:t xml:space="preserve">Taxa nominal</w:t>
+            </w:r>
+          </w:p>
+        </w:tc>
+        <w:tc>
+          <w:tcPr/>
+          <w:p>
+            <w:pPr>
+              <w:pStyle w:val="Compact"/>
+              <w:jc w:val="left"/>
+            </w:pPr>
+            <w:r>
+              <w:rPr>
+                <w:bCs/>
+                <w:b/>
+              </w:rPr>
+              <w:t xml:space="preserve">8,8945% a.a.</w:t>
+            </w:r>
+            <w:r>
+              <w:t xml:space="preserve"> </w:t>
+            </w:r>
+            <w:r>
+              <w:t xml:space="preserve">(juros mensais compostos; taxa em Currency como no VBA; sem considerar bônus de adimplência)</w:t>
+            </w:r>
+          </w:p>
+        </w:tc>
+      </w:tr>
+      <w:tr>
+        <w:tc>
+          <w:tcPr/>
+          <w:p>
+            <w:pPr>
+              <w:pStyle w:val="Compact"/>
+              <w:jc w:val="left"/>
+            </w:pPr>
+            <w:r>
+              <w:t xml:space="preserve">Prazo total</w:t>
+            </w:r>
+          </w:p>
+        </w:tc>
+        <w:tc>
+          <w:tcPr/>
+          <w:p>
+            <w:pPr>
+              <w:pStyle w:val="Compact"/>
+              <w:jc w:val="left"/>
+            </w:pPr>
+            <w:r>
+              <w:t xml:space="preserve">144 meses (12 anos)</w:t>
+            </w:r>
+          </w:p>
+        </w:tc>
+      </w:tr>
+      <w:tr>
+        <w:tc>
+          <w:tcPr/>
+          <w:p>
+            <w:pPr>
+              <w:pStyle w:val="Compact"/>
+              <w:jc w:val="left"/>
+            </w:pPr>
+            <w:r>
+              <w:t xml:space="preserve">Carência testada</w:t>
+            </w:r>
+          </w:p>
+        </w:tc>
+        <w:tc>
+          <w:tcPr/>
+          <w:p>
+            <w:pPr>
+              <w:pStyle w:val="Compact"/>
+              <w:jc w:val="left"/>
+            </w:pPr>
+            <w:r>
+              <w:t xml:space="preserve">12 / 24 / 36 meses (juros pagos trimestralmente na carência; capitalização dos não pagos)</w:t>
+            </w:r>
+          </w:p>
+        </w:tc>
+      </w:tr>
+      <w:tr>
+        <w:tc>
+          <w:tcPr/>
+          <w:p>
+            <w:pPr>
+              <w:pStyle w:val="Compact"/>
+              <w:jc w:val="left"/>
+            </w:pPr>
+            <w:r>
+              <w:t xml:space="preserve">Receita BRUTA anual</w:t>
+            </w:r>
+          </w:p>
+        </w:tc>
+        <w:tc>
+          <w:tcPr/>
+          <w:p>
+            <w:pPr>
+              <w:pStyle w:val="Compact"/>
+              <w:jc w:val="left"/>
+            </w:pPr>
+            <w:r>
+              <w:t xml:space="preserve">Estudo v3: ano 1 R$ 2.750.000 · ano 2 R$ 3.850.000 · anos 3–12 R$ 4.791.000 (teto EPP)</w:t>
+            </w:r>
+          </w:p>
+        </w:tc>
+      </w:tr>
+      <w:tr>
+        <w:tc>
+          <w:tcPr/>
+          <w:p>
+            <w:pPr>
+              <w:pStyle w:val="Compact"/>
+              <w:jc w:val="left"/>
+            </w:pPr>
+            <w:r>
+              <w:t xml:space="preserve">Custo padrão</w:t>
+            </w:r>
+          </w:p>
+        </w:tc>
+        <w:tc>
+          <w:tcPr/>
+          <w:p>
+            <w:pPr>
+              <w:pStyle w:val="Compact"/>
+              <w:jc w:val="left"/>
+            </w:pPr>
+            <w:r>
+              <w:rPr>
+                <w:bCs/>
+                <w:b/>
+              </w:rPr>
+              <w:t xml:space="preserve">Faixa indicada pelo consultor: 76,72% a 84,39%</w:t>
+            </w:r>
+            <w:r>
+              <w:t xml:space="preserve"> </w:t>
+            </w:r>
+            <w:r>
+              <w:t xml:space="preserve">(o enquadramento exato é do sistema do BNB — resultados nos dois extremos)</w:t>
+            </w:r>
+          </w:p>
+        </w:tc>
+      </w:tr>
+      <w:tr>
+        <w:tc>
+          <w:tcPr/>
+          <w:p>
+            <w:pPr>
+              <w:pStyle w:val="Compact"/>
+              <w:jc w:val="left"/>
+            </w:pPr>
+            <w:r>
+              <w:t xml:space="preserve">Dívidas existentes (SER)</w:t>
+            </w:r>
+          </w:p>
+        </w:tc>
+        <w:tc>
+          <w:tcPr/>
+          <w:p>
+            <w:pPr>
+              <w:pStyle w:val="Compact"/>
+              <w:jc w:val="left"/>
+            </w:pPr>
+            <w:r>
+              <w:t xml:space="preserve">Nenhuma — empresa constituída em 28/04/2026</w:t>
+            </w:r>
+          </w:p>
+        </w:tc>
+      </w:tr>
+      <w:tr>
+        <w:tc>
+          <w:tcPr/>
+          <w:p>
+            <w:pPr>
+              <w:pStyle w:val="Compact"/>
+              <w:jc w:val="left"/>
+            </w:pPr>
+            <w:r>
+              <w:t xml:space="preserve">Amortização</w:t>
+            </w:r>
+          </w:p>
+        </w:tc>
+        <w:tc>
+          <w:tcPr/>
+          <w:p>
+            <w:pPr>
+              <w:pStyle w:val="Compact"/>
+              <w:jc w:val="left"/>
+            </w:pPr>
+            <w:r>
+              <w:t xml:space="preserve">Anual (12º mês), curva</w:t>
+            </w:r>
+            <w:r>
+              <w:t xml:space="preserve"> </w:t>
+            </w:r>
+            <w:r>
+              <w:rPr>
+                <w:bCs/>
+                <w:b/>
+              </w:rPr>
+              <w:t xml:space="preserve">equalizada</w:t>
+            </w:r>
+            <w:r>
+              <w:t xml:space="preserve"> </w:t>
+            </w:r>
+            <w:r>
+              <w:t xml:space="preserve">(comprometimento igual em todos os anos, como a planilha faz nativo)</w:t>
+            </w:r>
+          </w:p>
+        </w:tc>
+      </w:tr>
+      <w:tr>
+        <w:tc>
+          <w:tcPr/>
+          <w:p>
+            <w:pPr>
+              <w:pStyle w:val="Compact"/>
+              <w:jc w:val="left"/>
+            </w:pPr>
+            <w:r>
+              <w:t xml:space="preserve">Janela do banco</w:t>
+            </w:r>
+          </w:p>
+        </w:tc>
+        <w:tc>
+          <w:tcPr/>
+          <w:p>
+            <w:pPr>
+              <w:pStyle w:val="Compact"/>
+              <w:jc w:val="left"/>
+            </w:pPr>
+            <w:r>
+              <w:t xml:space="preserve">Comprometimento da capacidade de pagamento entre</w:t>
+            </w:r>
+            <w:r>
+              <w:t xml:space="preserve"> </w:t>
+            </w:r>
+            <w:r>
+              <w:rPr>
+                <w:bCs/>
+                <w:b/>
+              </w:rPr>
+              <w:t xml:space="preserve">30% e 50%</w:t>
+            </w:r>
+          </w:p>
+        </w:tc>
+      </w:tr>
+    </w:tbl>
+    <w:bookmarkEnd w:id="114"/>
+    <w:bookmarkStart w:id="115" w:name="X521604761859523483414a3fc2913dab17ddd21"/>
+    <w:p>
+      <w:pPr>
+        <w:pStyle w:val="Heading2"/>
+      </w:pPr>
+      <w:r>
+        <w:t xml:space="preserve">Resultado 1 — O pleito de R$ 4.800.000 NÃO passa em nenhuma combinação</w:t>
+      </w:r>
+    </w:p>
+    <w:tbl>
+      <w:tblPr>
+        <w:tblStyle w:val="Table"/>
+        <w:tblW w:type="pct" w:w="5000"/>
+        <w:tblLook w:firstRow="1" w:lastRow="0" w:firstColumn="0" w:lastColumn="0" w:noHBand="0" w:noVBand="0" w:val="0020"/>
+        <w:jc w:val="start"/>
+      </w:tblPr>
+      <w:tblGrid>
+        <w:gridCol w:w="1980"/>
+        <w:gridCol w:w="1980"/>
+        <w:gridCol w:w="1980"/>
+        <w:gridCol w:w="1980"/>
+      </w:tblGrid>
+      <w:tr>
+        <w:trPr>
+          <w:tblHeader w:val="true"/>
+        </w:trPr>
+        <w:tc>
+          <w:tcPr/>
+          <w:p>
+            <w:pPr>
+              <w:pStyle w:val="Compact"/>
+              <w:jc w:val="left"/>
+            </w:pPr>
+            <w:r>
+              <w:t xml:space="preserve">Custo padrão</w:t>
+            </w:r>
+          </w:p>
+        </w:tc>
+        <w:tc>
+          <w:tcPr/>
+          <w:p>
+            <w:pPr>
+              <w:pStyle w:val="Compact"/>
+              <w:jc w:val="left"/>
+            </w:pPr>
+            <w:r>
+              <w:t xml:space="preserve">Carência 12m</w:t>
+            </w:r>
+          </w:p>
+        </w:tc>
+        <w:tc>
+          <w:tcPr/>
+          <w:p>
+            <w:pPr>
+              <w:pStyle w:val="Compact"/>
+              <w:jc w:val="left"/>
+            </w:pPr>
+            <w:r>
+              <w:t xml:space="preserve">Carência 24m</w:t>
+            </w:r>
+          </w:p>
+        </w:tc>
+        <w:tc>
+          <w:tcPr/>
+          <w:p>
+            <w:pPr>
+              <w:pStyle w:val="Compact"/>
+              <w:jc w:val="left"/>
+            </w:pPr>
+            <w:r>
+              <w:t xml:space="preserve">Carência 36m</w:t>
+            </w:r>
+          </w:p>
+        </w:tc>
+      </w:tr>
+      <w:tr>
+        <w:tc>
+          <w:tcPr/>
+          <w:p>
+            <w:pPr>
+              <w:pStyle w:val="Compact"/>
+              <w:jc w:val="left"/>
+            </w:pPr>
+            <w:r>
+              <w:t xml:space="preserve">76,72% (piso)</w:t>
+            </w:r>
+          </w:p>
+        </w:tc>
+        <w:tc>
+          <w:tcPr/>
+          <w:p>
+            <w:pPr>
+              <w:pStyle w:val="Compact"/>
+              <w:jc w:val="left"/>
+            </w:pPr>
+            <w:r>
+              <w:t xml:space="preserve">51,3% — fora</w:t>
+            </w:r>
+          </w:p>
+        </w:tc>
+        <w:tc>
+          <w:tcPr/>
+          <w:p>
+            <w:pPr>
+              <w:pStyle w:val="Compact"/>
+              <w:jc w:val="left"/>
+            </w:pPr>
+            <w:r>
+              <w:t xml:space="preserve">54,9% — fora</w:t>
+            </w:r>
+          </w:p>
+        </w:tc>
+        <w:tc>
+          <w:tcPr/>
+          <w:p>
+            <w:pPr>
+              <w:pStyle w:val="Compact"/>
+              <w:jc w:val="left"/>
+            </w:pPr>
+            <w:r>
+              <w:t xml:space="preserve">61,2% — fora</w:t>
+            </w:r>
+          </w:p>
+        </w:tc>
+      </w:tr>
+      <w:tr>
+        <w:tc>
+          <w:tcPr/>
+          <w:p>
+            <w:pPr>
+              <w:pStyle w:val="Compact"/>
+              <w:jc w:val="left"/>
+            </w:pPr>
+            <w:r>
+              <w:t xml:space="preserve">84,39% (teto)</w:t>
+            </w:r>
+          </w:p>
+        </w:tc>
+        <w:tc>
+          <w:tcPr/>
+          <w:p>
+            <w:pPr>
+              <w:pStyle w:val="Compact"/>
+              <w:jc w:val="left"/>
+            </w:pPr>
+            <w:r>
+              <w:t xml:space="preserve">91,3–91,5% — fora</w:t>
+            </w:r>
+          </w:p>
+        </w:tc>
+        <w:tc>
+          <w:tcPr/>
+          <w:p>
+            <w:pPr>
+              <w:pStyle w:val="Compact"/>
+              <w:jc w:val="left"/>
+            </w:pPr>
+            <w:r>
+              <w:t xml:space="preserve">96,8–96,9% — fora</w:t>
+            </w:r>
+          </w:p>
+        </w:tc>
+        <w:tc>
+          <w:tcPr/>
+          <w:p>
+            <w:pPr>
+              <w:pStyle w:val="Compact"/>
+              <w:jc w:val="left"/>
+            </w:pPr>
+            <w:r>
+              <w:t xml:space="preserve">108,0–108,2% — fora</w:t>
+            </w:r>
+          </w:p>
+        </w:tc>
+      </w:tr>
+    </w:tbl>
+    <w:bookmarkEnd w:id="115"/>
+    <w:bookmarkStart w:id="116" w:name="X883187e78f6390cdfca9ce08ffba512655c9245"/>
+    <w:p>
+      <w:pPr>
+        <w:pStyle w:val="Heading2"/>
+      </w:pPr>
+      <w:r>
+        <w:t xml:space="preserve">Resultado 2 — Principal MÁXIMO aprovável (comprometimento equalizado ≤ 50%)</w:t>
+      </w:r>
+    </w:p>
+    <w:tbl>
+      <w:tblPr>
+        <w:tblStyle w:val="Table"/>
+        <w:tblW w:type="pct" w:w="5000"/>
+        <w:tblLook w:firstRow="1" w:lastRow="0" w:firstColumn="0" w:lastColumn="0" w:noHBand="0" w:noVBand="0" w:val="0020"/>
+        <w:jc w:val="start"/>
+      </w:tblPr>
+      <w:tblGrid>
+        <w:gridCol w:w="1980"/>
+        <w:gridCol w:w="1980"/>
+        <w:gridCol w:w="1980"/>
+        <w:gridCol w:w="1980"/>
+      </w:tblGrid>
+      <w:tr>
+        <w:trPr>
+          <w:tblHeader w:val="true"/>
+        </w:trPr>
+        <w:tc>
+          <w:tcPr/>
+          <w:p>
+            <w:pPr>
+              <w:pStyle w:val="Compact"/>
+              <w:jc w:val="left"/>
+            </w:pPr>
+            <w:r>
+              <w:t xml:space="preserve">Custo padrão</w:t>
+            </w:r>
+          </w:p>
+        </w:tc>
+        <w:tc>
+          <w:tcPr/>
+          <w:p>
+            <w:pPr>
+              <w:pStyle w:val="Compact"/>
+              <w:jc w:val="left"/>
+            </w:pPr>
+            <w:r>
+              <w:t xml:space="preserve">Carência 12m</w:t>
+            </w:r>
+          </w:p>
+        </w:tc>
+        <w:tc>
+          <w:tcPr/>
+          <w:p>
+            <w:pPr>
+              <w:pStyle w:val="Compact"/>
+              <w:jc w:val="left"/>
+            </w:pPr>
+            <w:r>
+              <w:t xml:space="preserve">Carência 24m</w:t>
+            </w:r>
+          </w:p>
+        </w:tc>
+        <w:tc>
+          <w:tcPr/>
+          <w:p>
+            <w:pPr>
+              <w:pStyle w:val="Compact"/>
+              <w:jc w:val="left"/>
+            </w:pPr>
+            <w:r>
+              <w:t xml:space="preserve">Carência 36m</w:t>
+            </w:r>
+          </w:p>
+        </w:tc>
+      </w:tr>
+      <w:tr>
+        <w:tc>
+          <w:tcPr/>
+          <w:p>
+            <w:pPr>
+              <w:pStyle w:val="Compact"/>
+              <w:jc w:val="left"/>
+            </w:pPr>
+            <w:r>
+              <w:rPr>
+                <w:bCs/>
+                <w:b/>
+              </w:rPr>
+              <w:t xml:space="preserve">76,72% (piso)</w:t>
+            </w:r>
+          </w:p>
+        </w:tc>
+        <w:tc>
+          <w:tcPr/>
+          <w:p>
+            <w:pPr>
+              <w:pStyle w:val="Compact"/>
+              <w:jc w:val="left"/>
+            </w:pPr>
+            <w:r>
+              <w:rPr>
+                <w:bCs/>
+                <w:b/>
+              </w:rPr>
+              <w:t xml:space="preserve">R$ 4.700.000</w:t>
+            </w:r>
+            <w:r>
+              <w:t xml:space="preserve"> </w:t>
+            </w:r>
+            <w:r>
+              <w:t xml:space="preserve">(49,9%)</w:t>
+            </w:r>
+          </w:p>
+        </w:tc>
+        <w:tc>
+          <w:tcPr/>
+          <w:p>
+            <w:pPr>
+              <w:pStyle w:val="Compact"/>
+              <w:jc w:val="left"/>
+            </w:pPr>
+            <w:r>
+              <w:rPr>
+                <w:bCs/>
+                <w:b/>
+              </w:rPr>
+              <w:t xml:space="preserve">R$ 4.460.000</w:t>
+            </w:r>
+            <w:r>
+              <w:t xml:space="preserve"> </w:t>
+            </w:r>
+            <w:r>
+              <w:t xml:space="preserve">(50,0%)</w:t>
+            </w:r>
+          </w:p>
+        </w:tc>
+        <w:tc>
+          <w:tcPr/>
+          <w:p>
+            <w:pPr>
+              <w:pStyle w:val="Compact"/>
+              <w:jc w:val="left"/>
+            </w:pPr>
+            <w:r>
+              <w:t xml:space="preserve">R$ 4.090.000 (49,9%)</w:t>
+            </w:r>
+          </w:p>
+        </w:tc>
+      </w:tr>
+      <w:tr>
+        <w:tc>
+          <w:tcPr/>
+          <w:p>
+            <w:pPr>
+              <w:pStyle w:val="Compact"/>
+              <w:jc w:val="left"/>
+            </w:pPr>
+            <w:r>
+              <w:rPr>
+                <w:bCs/>
+                <w:b/>
+              </w:rPr>
+              <w:t xml:space="preserve">84,39% (teto)</w:t>
+            </w:r>
+          </w:p>
+        </w:tc>
+        <w:tc>
+          <w:tcPr/>
+          <w:p>
+            <w:pPr>
+              <w:pStyle w:val="Compact"/>
+              <w:jc w:val="left"/>
+            </w:pPr>
+            <w:r>
+              <w:t xml:space="preserve">R$ 3.150.000 (49,8%)</w:t>
+            </w:r>
+          </w:p>
+        </w:tc>
+        <w:tc>
+          <w:tcPr/>
+          <w:p>
+            <w:pPr>
+              <w:pStyle w:val="Compact"/>
+              <w:jc w:val="left"/>
+            </w:pPr>
+            <w:r>
+              <w:rPr>
+                <w:bCs/>
+                <w:b/>
+              </w:rPr>
+              <w:t xml:space="preserve">R$ 2.990.000</w:t>
+            </w:r>
+            <w:r>
+              <w:t xml:space="preserve"> </w:t>
+            </w:r>
+            <w:r>
+              <w:t xml:space="preserve">(50,0%)</w:t>
+            </w:r>
+          </w:p>
+        </w:tc>
+        <w:tc>
+          <w:tcPr/>
+          <w:p>
+            <w:pPr>
+              <w:pStyle w:val="Compact"/>
+              <w:jc w:val="left"/>
+            </w:pPr>
+            <w:r>
+              <w:t xml:space="preserve">R$ 2.740.000 (49,9%)</w:t>
+            </w:r>
+          </w:p>
+        </w:tc>
+      </w:tr>
+    </w:tbl>
+    <w:p>
+      <w:pPr>
+        <w:pStyle w:val="BodyText"/>
+      </w:pPr>
+      <w:r>
+        <w:t xml:space="preserve">Leituras importantes:</w:t>
+      </w:r>
+      <w:r>
+        <w:t xml:space="preserve"> </w:t>
+      </w:r>
+      <w:r>
+        <w:t xml:space="preserve">1.</w:t>
+      </w:r>
+      <w:r>
+        <w:t xml:space="preserve"> </w:t>
+      </w:r>
+      <w:r>
+        <w:rPr>
+          <w:bCs/>
+          <w:b/>
+        </w:rPr>
+        <w:t xml:space="preserve">O custo padrão decide o projeto.</w:t>
+      </w:r>
+      <w:r>
+        <w:t xml:space="preserve"> </w:t>
+      </w:r>
+      <w:r>
+        <w:t xml:space="preserve">Entre os extremos da faixa (76,72% × 84,39%), o financiamento aprovável varia de ~R$ 3,0 mi a ~R$ 4,5–4,7 mi — exatamente a sensibilidade documentada na skill (nota de honestidade). Antes de protocolar, vale confirmar no sistema/analista qual enquadramento (natureza indústria × porte pequena) será aplicado.</w:t>
+      </w:r>
+      <w:r>
+        <w:t xml:space="preserve"> </w:t>
+      </w:r>
+      <w:r>
+        <w:t xml:space="preserve">2.</w:t>
+      </w:r>
+      <w:r>
+        <w:t xml:space="preserve"> </w:t>
+      </w:r>
+      <w:r>
+        <w:rPr>
+          <w:bCs/>
+          <w:b/>
+        </w:rPr>
+        <w:t xml:space="preserve">Carência menor melhora o comprometimento</w:t>
+      </w:r>
+      <w:r>
+        <w:t xml:space="preserve"> </w:t>
+      </w:r>
+      <w:r>
+        <w:t xml:space="preserve">neste caso: com 12 meses de carência sobram 11 amortizações anuais (em vez de 10 ou 9), diluindo o principal — e o ramp-up do ano 2 (R$ 3,85 mi) já sustenta a primeira amortização equalizada.</w:t>
+      </w:r>
+      <w:r>
+        <w:t xml:space="preserve"> </w:t>
+      </w:r>
+      <w:r>
+        <w:t xml:space="preserve">3.</w:t>
+      </w:r>
+      <w:r>
+        <w:t xml:space="preserve"> </w:t>
+      </w:r>
+      <w:r>
+        <w:rPr>
+          <w:bCs/>
+          <w:b/>
+        </w:rPr>
+        <w:t xml:space="preserve">Coerência com o estudo v3:</w:t>
+      </w:r>
+      <w:r>
+        <w:t xml:space="preserve"> </w:t>
+      </w:r>
+      <w:r>
+        <w:t xml:space="preserve">no piso da faixa de custo, a simulação oficial confirma a recomendação do §13.4 (financiar ~R$ 4,0–4,5 mi em 12 anos) — R$ 4.460.000 com carência de 24 meses fecha a janela em 50,0%. No teto da faixa (84,39% ≈ o custo operacional reconstruído do próprio estudo, 83%), o aprovável cai para ~R$ 3,0 mi, exigindo mais contrapartida própria (o capital subscrito de R$ 7,5 milhões comporta).</w:t>
+      </w:r>
+      <w:r>
+        <w:t xml:space="preserve"> </w:t>
+      </w:r>
+      <w:r>
+        <w:t xml:space="preserve">4.</w:t>
+      </w:r>
+      <w:r>
+        <w:t xml:space="preserve"> </w:t>
+      </w:r>
+      <w:r>
+        <w:rPr>
+          <w:bCs/>
+          <w:b/>
+        </w:rPr>
+        <w:t xml:space="preserve">Ano 1 (carência):</w:t>
+      </w:r>
+      <w:r>
+        <w:t xml:space="preserve"> </w:t>
+      </w:r>
+      <w:r>
+        <w:t xml:space="preserve">capacidade de pagamento positiva nos dois extremos (R$ 227 mil no piso; R$ 16 mil no teto do custo) — sem gatilho de alerta, mas no custo alto a folga do ano 1 é mínima: o cronograma de aporte dos sócios deve cobrir os juros trimestrais da carência com margem.</w:t>
+      </w:r>
+    </w:p>
+    <w:bookmarkEnd w:id="116"/>
+    <w:bookmarkStart w:id="117" w:name="cenário-recomendado-para-o-protocolo"/>
+    <w:p>
+      <w:pPr>
+        <w:pStyle w:val="Heading2"/>
+      </w:pPr>
+      <w:r>
+        <w:t xml:space="preserve">Cenário recomendado para o protocolo</w:t>
+      </w:r>
+    </w:p>
+    <w:p>
+      <w:pPr>
+        <w:pStyle w:val="FirstParagraph"/>
+      </w:pPr>
+      <w:r>
+        <w:rPr>
+          <w:bCs/>
+          <w:b/>
+        </w:rPr>
+        <w:t xml:space="preserve">Pleito de R$ 4.400.000, prazo 144 meses, carência 24 meses</w:t>
+      </w:r>
+      <w:r>
+        <w:t xml:space="preserve"> </w:t>
+      </w:r>
+      <w:r>
+        <w:t xml:space="preserve">— passa no piso da faixa (comprometimento equalizado de 49,1%) e deixa claro o plano B negociado: se o analista aplicar custo padrão no teto da faixa, redimensionar para ~R$ 3,0 mi com contrapartida própria maior, sem alterar o projeto físico. Alternativa de defesa: demonstrar com o próprio estudo (margem de contribuição de 30–31% + fixos de 13%) que o custo operacional real da planta automática fica abaixo do teto da faixa.</w:t>
+      </w:r>
+    </w:p>
+    <w:tbl>
+      <w:tblPr>
+        <w:tblStyle w:val="Table"/>
+        <w:tblW w:type="pct" w:w="5000"/>
+        <w:tblLook w:firstRow="1" w:lastRow="0" w:firstColumn="0" w:lastColumn="0" w:noHBand="0" w:noVBand="0" w:val="0020"/>
+        <w:jc w:val="start"/>
+      </w:tblPr>
+      <w:tblGrid>
+        <w:gridCol w:w="3960"/>
+        <w:gridCol w:w="3960"/>
+      </w:tblGrid>
+      <w:tr>
+        <w:trPr>
+          <w:tblHeader w:val="true"/>
+        </w:trPr>
+        <w:tc>
+          <w:tcPr/>
+          <w:p>
+            <w:pPr>
+              <w:pStyle w:val="Compact"/>
+              <w:jc w:val="left"/>
+            </w:pPr>
+            <w:r>
+              <w:t xml:space="preserve">Detalhe do cenário R$ 4.400.000 · custo 76,72% · carência 24m</w:t>
+            </w:r>
+          </w:p>
+        </w:tc>
+        <w:tc>
+          <w:tcPr/>
+          <w:p>
+            <w:pPr>
+              <w:pStyle w:val="Compact"/>
+              <w:jc w:val="left"/>
+            </w:pPr>
+            <w:r>
+              <w:t xml:space="preserve">valor</w:t>
+            </w:r>
+          </w:p>
+        </w:tc>
+      </w:tr>
+      <w:tr>
+        <w:tc>
+          <w:tcPr/>
+          <w:p>
+            <w:pPr>
+              <w:pStyle w:val="Compact"/>
+              <w:jc w:val="left"/>
+            </w:pPr>
+            <w:r>
+              <w:t xml:space="preserve">Comprometimento equalizado (anos 3–12)</w:t>
+            </w:r>
+          </w:p>
+        </w:tc>
+        <w:tc>
+          <w:tcPr/>
+          <w:p>
+            <w:pPr>
+              <w:pStyle w:val="Compact"/>
+              <w:jc w:val="left"/>
+            </w:pPr>
+            <w:r>
+              <w:t xml:space="preserve">49,1% (dentro de 30–50%)</w:t>
+            </w:r>
+          </w:p>
+        </w:tc>
+      </w:tr>
+      <w:tr>
+        <w:tc>
+          <w:tcPr/>
+          <w:p>
+            <w:pPr>
+              <w:pStyle w:val="Compact"/>
+              <w:jc w:val="left"/>
+            </w:pPr>
+            <w:r>
+              <w:t xml:space="preserve">Capacidade de pagamento no regime</w:t>
+            </w:r>
+          </w:p>
+        </w:tc>
+        <w:tc>
+          <w:tcPr/>
+          <w:p>
+            <w:pPr>
+              <w:pStyle w:val="Compact"/>
+              <w:jc w:val="left"/>
+            </w:pPr>
+            <w:r>
+              <w:t xml:space="preserve">R$ 0,74–1,08 mi/ano (crescente com a queda dos juros)</w:t>
+            </w:r>
+          </w:p>
+        </w:tc>
+      </w:tr>
+      <w:tr>
+        <w:tc>
+          <w:tcPr/>
+          <w:p>
+            <w:pPr>
+              <w:pStyle w:val="Compact"/>
+              <w:jc w:val="left"/>
+            </w:pPr>
+            <w:r>
+              <w:t xml:space="preserve">Juros da carência (pagos trimestralmente)</w:t>
+            </w:r>
+          </w:p>
+        </w:tc>
+        <w:tc>
+          <w:tcPr/>
+          <w:p>
+            <w:pPr>
+              <w:pStyle w:val="Compact"/>
+              <w:jc w:val="left"/>
+            </w:pPr>
+            <w:r>
+              <w:t xml:space="preserve">~R$ 379 mil/ano</w:t>
+            </w:r>
+          </w:p>
+        </w:tc>
+      </w:tr>
+    </w:tbl>
+    <w:p>
+      <w:pPr>
+        <w:pStyle w:val="BodyText"/>
+      </w:pPr>
+      <w:r>
+        <w:rPr>
+          <w:iCs/>
+          <w:i/>
+        </w:rPr>
+        <w:t xml:space="preserve">Notas de rigor: (i) simulação pela regra oficial de desembolso (aplicação integral no ano 1 — conservadora: superestima os juros iniciais; o desembolso real escalonado do cronograma físico só melhora o quadro); (ii) taxa cheia, sem bônus de adimplência (pagamento pontual reduz o desembolso efetivo); (iii) valores a validar na simulação do sistema do BNB no protocolo — este anexo usa o mesmo algoritmo da planilha oficial, mas o enquadramento de custo padrão e a taxa contratual final são definidos pelo banco.</w:t>
+      </w:r>
+    </w:p>
+    <w:bookmarkEnd w:id="117"/>
+    <w:bookmarkEnd w:id="118"/>
     <w:sectPr/>
   </w:body>
 </w:document>

</xml_diff>